<commit_message>
chat top and bottom sections completed
</commit_message>
<xml_diff>
--- a/Roadmap.docx
+++ b/Roadmap.docx
@@ -146,6 +146,317 @@
       </w:pPr>
       <w:r>
         <w:t>below search item div is added which contains the user image and a texts div which contain span for username and below it a &lt;p&gt; for the latest message then 5 to 6 items are more added and the overflow is eliminated by using overflow auto</w:t>
+      </w:r>
+    </w:p>
+    <w:p>
+      <w:pPr>
+        <w:pStyle w:val="ListParagraph"/>
+        <w:numPr>
+          <w:ilvl w:val="0"/>
+          <w:numId w:val="1"/>
+        </w:numPr>
+      </w:pPr>
+      <w:r>
+        <w:t>then move to next section which is chat section, it has 3 main sections top, center and bottom</w:t>
+      </w:r>
+    </w:p>
+    <w:p>
+      <w:pPr>
+        <w:pStyle w:val="ListParagraph"/>
+        <w:numPr>
+          <w:ilvl w:val="0"/>
+          <w:numId w:val="1"/>
+        </w:numPr>
+      </w:pPr>
+      <w:r>
+        <w:t xml:space="preserve">in the top div there are again 2 </w:t>
+      </w:r>
+      <w:proofErr w:type="spellStart"/>
+      <w:r>
+        <w:t>divs</w:t>
+      </w:r>
+      <w:proofErr w:type="spellEnd"/>
+      <w:r>
+        <w:t xml:space="preserve"> </w:t>
+      </w:r>
+      <w:proofErr w:type="spellStart"/>
+      <w:r>
+        <w:t>userInfo</w:t>
+      </w:r>
+      <w:proofErr w:type="spellEnd"/>
+      <w:r>
+        <w:t xml:space="preserve"> which contains </w:t>
+      </w:r>
+      <w:proofErr w:type="spellStart"/>
+      <w:r>
+        <w:t>img</w:t>
+      </w:r>
+      <w:proofErr w:type="spellEnd"/>
+      <w:r>
+        <w:t>, username and a &lt;p&gt; and the icons div containing phone, video and info icons</w:t>
+      </w:r>
+    </w:p>
+    <w:p>
+      <w:pPr>
+        <w:pStyle w:val="ListParagraph"/>
+        <w:numPr>
+          <w:ilvl w:val="0"/>
+          <w:numId w:val="1"/>
+        </w:numPr>
+      </w:pPr>
+      <w:r>
+        <w:t xml:space="preserve">now next is the bottom div which contains a div containing three icons </w:t>
+      </w:r>
+      <w:proofErr w:type="spellStart"/>
+      <w:r>
+        <w:t>img</w:t>
+      </w:r>
+      <w:proofErr w:type="spellEnd"/>
+      <w:r>
+        <w:t>, camera and mic and then the input for message and then the div for emoji icon and next is the send button</w:t>
+      </w:r>
+    </w:p>
+    <w:p>
+      <w:pPr>
+        <w:pStyle w:val="ListParagraph"/>
+        <w:numPr>
+          <w:ilvl w:val="0"/>
+          <w:numId w:val="1"/>
+        </w:numPr>
+      </w:pPr>
+      <w:r>
+        <w:t xml:space="preserve">for </w:t>
+      </w:r>
+      <w:proofErr w:type="spellStart"/>
+      <w:r>
+        <w:t>emojis</w:t>
+      </w:r>
+      <w:proofErr w:type="spellEnd"/>
+      <w:r>
+        <w:t xml:space="preserve"> use </w:t>
+      </w:r>
+      <w:proofErr w:type="spellStart"/>
+      <w:r>
+        <w:t>npm</w:t>
+      </w:r>
+      <w:proofErr w:type="spellEnd"/>
+      <w:r>
+        <w:t xml:space="preserve"> install emoji-picker-react and use the </w:t>
+      </w:r>
+      <w:proofErr w:type="spellStart"/>
+      <w:r>
+        <w:t>EmojiPicker</w:t>
+      </w:r>
+      <w:proofErr w:type="spellEnd"/>
+      <w:r>
+        <w:t xml:space="preserve"> component for </w:t>
+      </w:r>
+      <w:proofErr w:type="spellStart"/>
+      <w:r>
+        <w:t>emojis</w:t>
+      </w:r>
+      <w:proofErr w:type="spellEnd"/>
+    </w:p>
+    <w:p>
+      <w:pPr>
+        <w:pStyle w:val="ListParagraph"/>
+        <w:numPr>
+          <w:ilvl w:val="0"/>
+          <w:numId w:val="1"/>
+        </w:numPr>
+      </w:pPr>
+      <w:r>
+        <w:t xml:space="preserve">now to set </w:t>
+      </w:r>
+      <w:proofErr w:type="spellStart"/>
+      <w:r>
+        <w:t>EmojiPicker</w:t>
+      </w:r>
+      <w:proofErr w:type="spellEnd"/>
+      <w:r>
+        <w:t xml:space="preserve"> to open on click use the </w:t>
+      </w:r>
+      <w:proofErr w:type="spellStart"/>
+      <w:r>
+        <w:t>useState</w:t>
+      </w:r>
+      <w:proofErr w:type="spellEnd"/>
+      <w:r>
+        <w:t xml:space="preserve"> of open and </w:t>
+      </w:r>
+      <w:proofErr w:type="spellStart"/>
+      <w:r>
+        <w:t>setOpen</w:t>
+      </w:r>
+      <w:proofErr w:type="spellEnd"/>
+      <w:r>
+        <w:t xml:space="preserve"> and connect it to the open attribute of </w:t>
+      </w:r>
+      <w:proofErr w:type="spellStart"/>
+      <w:r>
+        <w:t>EmojiPicker</w:t>
+      </w:r>
+      <w:proofErr w:type="spellEnd"/>
+      <w:r>
+        <w:t xml:space="preserve"> component</w:t>
+      </w:r>
+      <w:r>
+        <w:t xml:space="preserve"> and set it to the </w:t>
+      </w:r>
+      <w:proofErr w:type="spellStart"/>
+      <w:r>
+        <w:t>onClick</w:t>
+      </w:r>
+      <w:proofErr w:type="spellEnd"/>
+      <w:r>
+        <w:t xml:space="preserve"> of </w:t>
+      </w:r>
+      <w:proofErr w:type="spellStart"/>
+      <w:r>
+        <w:t>imaoji</w:t>
+      </w:r>
+      <w:proofErr w:type="spellEnd"/>
+      <w:r>
+        <w:t xml:space="preserve"> </w:t>
+      </w:r>
+      <w:proofErr w:type="spellStart"/>
+      <w:r>
+        <w:t>img</w:t>
+      </w:r>
+      <w:proofErr w:type="spellEnd"/>
+    </w:p>
+    <w:p>
+      <w:pPr>
+        <w:pStyle w:val="ListParagraph"/>
+        <w:numPr>
+          <w:ilvl w:val="0"/>
+          <w:numId w:val="1"/>
+        </w:numPr>
+      </w:pPr>
+      <w:r>
+        <w:t xml:space="preserve">use another </w:t>
+      </w:r>
+      <w:proofErr w:type="spellStart"/>
+      <w:r>
+        <w:t>useState</w:t>
+      </w:r>
+      <w:proofErr w:type="spellEnd"/>
+      <w:r>
+        <w:t xml:space="preserve"> for the text of input by giving the text to the value attribute of input box and giving the </w:t>
+      </w:r>
+      <w:proofErr w:type="spellStart"/>
+      <w:r>
+        <w:t>setText</w:t>
+      </w:r>
+      <w:proofErr w:type="spellEnd"/>
+      <w:r>
+        <w:t xml:space="preserve"> to the </w:t>
+      </w:r>
+      <w:proofErr w:type="spellStart"/>
+      <w:r>
+        <w:t>onChange</w:t>
+      </w:r>
+      <w:proofErr w:type="spellEnd"/>
+      <w:r>
+        <w:t xml:space="preserve"> attribute using {(e)=&gt;</w:t>
+      </w:r>
+      <w:proofErr w:type="spellStart"/>
+      <w:r>
+        <w:t>setText</w:t>
+      </w:r>
+      <w:proofErr w:type="spellEnd"/>
+      <w:r>
+        <w:t>(</w:t>
+      </w:r>
+      <w:proofErr w:type="spellStart"/>
+      <w:proofErr w:type="gramStart"/>
+      <w:r>
+        <w:t>e.target</w:t>
+      </w:r>
+      <w:proofErr w:type="gramEnd"/>
+      <w:r>
+        <w:t>.value</w:t>
+      </w:r>
+      <w:proofErr w:type="spellEnd"/>
+      <w:r>
+        <w:t>)}</w:t>
+      </w:r>
+    </w:p>
+    <w:p>
+      <w:pPr>
+        <w:pStyle w:val="ListParagraph"/>
+        <w:numPr>
+          <w:ilvl w:val="0"/>
+          <w:numId w:val="1"/>
+        </w:numPr>
+      </w:pPr>
+      <w:r>
+        <w:t xml:space="preserve">now to add emoji in the text use the </w:t>
+      </w:r>
+      <w:proofErr w:type="spellStart"/>
+      <w:r>
+        <w:t>onEmojiClick</w:t>
+      </w:r>
+      <w:proofErr w:type="spellEnd"/>
+      <w:r>
+        <w:t xml:space="preserve"> attribute of </w:t>
+      </w:r>
+      <w:proofErr w:type="spellStart"/>
+      <w:r>
+        <w:t>EmojiPicker</w:t>
+      </w:r>
+      <w:proofErr w:type="spellEnd"/>
+      <w:r>
+        <w:t xml:space="preserve"> component and give it the function of </w:t>
+      </w:r>
+      <w:proofErr w:type="spellStart"/>
+      <w:r>
+        <w:t>handleEmoji</w:t>
+      </w:r>
+      <w:proofErr w:type="spellEnd"/>
+      <w:r>
+        <w:t xml:space="preserve"> which will take the event e now make this function and in it use </w:t>
+      </w:r>
+      <w:proofErr w:type="spellStart"/>
+      <w:r>
+        <w:t>setText</w:t>
+      </w:r>
+      <w:proofErr w:type="spellEnd"/>
+      <w:r>
+        <w:t xml:space="preserve"> to make text </w:t>
+      </w:r>
+      <w:proofErr w:type="spellStart"/>
+      <w:r>
+        <w:t>prev+</w:t>
+      </w:r>
+      <w:proofErr w:type="gramStart"/>
+      <w:r>
+        <w:t>e.emoji</w:t>
+      </w:r>
+      <w:proofErr w:type="spellEnd"/>
+      <w:proofErr w:type="gramEnd"/>
+      <w:r>
+        <w:t xml:space="preserve"> and </w:t>
+      </w:r>
+      <w:proofErr w:type="spellStart"/>
+      <w:r>
+        <w:t>setOpen</w:t>
+      </w:r>
+      <w:proofErr w:type="spellEnd"/>
+      <w:r>
+        <w:t xml:space="preserve"> to false so that emoji picker closes itself</w:t>
+      </w:r>
+    </w:p>
+    <w:p>
+      <w:pPr>
+        <w:pStyle w:val="ListParagraph"/>
+        <w:numPr>
+          <w:ilvl w:val="0"/>
+          <w:numId w:val="1"/>
+        </w:numPr>
+      </w:pPr>
+      <w:r>
+        <w:t>now to set the position of picker enclose the emoji component in a div and then set the positions to relative and absolute</w:t>
       </w:r>
       <w:bookmarkStart w:id="0" w:name="_GoBack"/>
       <w:bookmarkEnd w:id="0"/>

</xml_diff>

<commit_message>
automatic scroll effect added
</commit_message>
<xml_diff>
--- a/Roadmap.docx
+++ b/Roadmap.docx
@@ -1,6 +1,6 @@
 
 <file path=word/document.xml><?xml version="1.0" encoding="utf-8"?>
-<w:document xmlns:wpc="http://schemas.microsoft.com/office/word/2010/wordprocessingCanvas" xmlns:cx="http://schemas.microsoft.com/office/drawing/2014/chartex" xmlns:cx1="http://schemas.microsoft.com/office/drawing/2015/9/8/chartex" xmlns:mc="http://schemas.openxmlformats.org/markup-compatibility/2006" xmlns:o="urn:schemas-microsoft-com:office:office" xmlns:r="http://schemas.openxmlformats.org/officeDocument/2006/relationships" xmlns:m="http://schemas.openxmlformats.org/officeDocument/2006/math" xmlns:v="urn:schemas-microsoft-com:vml" xmlns:wp14="http://schemas.microsoft.com/office/word/2010/wordprocessingDrawing" xmlns:wp="http://schemas.openxmlformats.org/drawingml/2006/wordprocessingDrawing" xmlns:w10="urn:schemas-microsoft-com:office:word" xmlns:w="http://schemas.openxmlformats.org/wordprocessingml/2006/main" xmlns:w14="http://schemas.microsoft.com/office/word/2010/wordml" xmlns:w15="http://schemas.microsoft.com/office/word/2012/wordml" xmlns:w16se="http://schemas.microsoft.com/office/word/2015/wordml/symex" xmlns:wpg="http://schemas.microsoft.com/office/word/2010/wordprocessingGroup" xmlns:wpi="http://schemas.microsoft.com/office/word/2010/wordprocessingInk" xmlns:wne="http://schemas.microsoft.com/office/word/2006/wordml" xmlns:wps="http://schemas.microsoft.com/office/word/2010/wordprocessingShape" mc:Ignorable="w14 w15 w16se wp14">
+<w:document xmlns:wpc="http://schemas.microsoft.com/office/word/2010/wordprocessingCanvas" xmlns:cx="http://schemas.microsoft.com/office/drawing/2014/chartex" xmlns:mc="http://schemas.openxmlformats.org/markup-compatibility/2006" xmlns:o="urn:schemas-microsoft-com:office:office" xmlns:r="http://schemas.openxmlformats.org/officeDocument/2006/relationships" xmlns:m="http://schemas.openxmlformats.org/officeDocument/2006/math" xmlns:v="urn:schemas-microsoft-com:vml" xmlns:wp14="http://schemas.microsoft.com/office/word/2010/wordprocessingDrawing" xmlns:wp="http://schemas.openxmlformats.org/drawingml/2006/wordprocessingDrawing" xmlns:w10="urn:schemas-microsoft-com:office:word" xmlns:w="http://schemas.openxmlformats.org/wordprocessingml/2006/main" xmlns:w14="http://schemas.microsoft.com/office/word/2010/wordml" xmlns:w15="http://schemas.microsoft.com/office/word/2012/wordml" xmlns:w16se="http://schemas.microsoft.com/office/word/2015/wordml/symex" xmlns:wpg="http://schemas.microsoft.com/office/word/2010/wordprocessingGroup" xmlns:wpi="http://schemas.microsoft.com/office/word/2010/wordprocessingInk" xmlns:wne="http://schemas.microsoft.com/office/word/2006/wordml" xmlns:wps="http://schemas.microsoft.com/office/word/2010/wordprocessingShape" mc:Ignorable="w14 w15 w16se wp14">
   <w:body>
     <w:p>
       <w:pPr>
@@ -552,13 +552,8 @@
           <w:numId w:val="1"/>
         </w:numPr>
       </w:pPr>
-      <w:proofErr w:type="gramStart"/>
-      <w:r>
-        <w:t>now</w:t>
-      </w:r>
-      <w:proofErr w:type="gramEnd"/>
-      <w:r>
-        <w:t xml:space="preserve"> the chat section is complete and move towards the details section </w:t>
+      <w:r>
+        <w:t xml:space="preserve">now the chat section is complete and move towards the details section </w:t>
       </w:r>
       <w:r>
         <w:t xml:space="preserve">which contains 2 main containers a user and info. User div contains user </w:t>
@@ -756,7 +751,13 @@
         </w:numPr>
       </w:pPr>
       <w:r>
-        <w:t xml:space="preserve">style the phots div present inside the options div and the </w:t>
+        <w:t>style the phot</w:t>
+      </w:r>
+      <w:r>
+        <w:t>o</w:t>
+      </w:r>
+      <w:r>
+        <w:t xml:space="preserve">s div present inside the options div and the </w:t>
       </w:r>
       <w:proofErr w:type="spellStart"/>
       <w:r>
@@ -765,9 +766,144 @@
       <w:proofErr w:type="spellEnd"/>
       <w:r>
         <w:t xml:space="preserve"> present inside the photos div</w:t>
+      </w:r>
+    </w:p>
+    <w:p>
+      <w:pPr>
+        <w:pStyle w:val="ListParagraph"/>
+        <w:numPr>
+          <w:ilvl w:val="0"/>
+          <w:numId w:val="1"/>
+        </w:numPr>
+      </w:pPr>
+      <w:r>
+        <w:t>style the download icon</w:t>
+      </w:r>
+    </w:p>
+    <w:p>
+      <w:pPr>
+        <w:pStyle w:val="ListParagraph"/>
+        <w:numPr>
+          <w:ilvl w:val="0"/>
+          <w:numId w:val="1"/>
+        </w:numPr>
+      </w:pPr>
+      <w:r>
+        <w:t>style the block User button</w:t>
+      </w:r>
+    </w:p>
+    <w:p>
+      <w:pPr>
+        <w:pStyle w:val="ListParagraph"/>
+        <w:numPr>
+          <w:ilvl w:val="0"/>
+          <w:numId w:val="1"/>
+        </w:numPr>
+      </w:pPr>
+      <w:r>
+        <w:t xml:space="preserve">now apply the </w:t>
+      </w:r>
+      <w:proofErr w:type="spellStart"/>
+      <w:r>
+        <w:t>useRef</w:t>
+      </w:r>
+      <w:proofErr w:type="spellEnd"/>
+      <w:r>
+        <w:t xml:space="preserve"> using </w:t>
+      </w:r>
+      <w:proofErr w:type="spellStart"/>
+      <w:r>
+        <w:t>useEffect</w:t>
+      </w:r>
+      <w:proofErr w:type="spellEnd"/>
+      <w:r>
+        <w:t xml:space="preserve"> hook to automatically scroll the chat from start to end on chat load</w:t>
+      </w:r>
+      <w:r>
+        <w:t xml:space="preserve"> and giving the </w:t>
+      </w:r>
+      <w:proofErr w:type="spellStart"/>
+      <w:r>
+        <w:t>scrollIntoViiew</w:t>
+      </w:r>
+      <w:proofErr w:type="spellEnd"/>
+      <w:r>
+        <w:t xml:space="preserve"> property with </w:t>
+      </w:r>
+      <w:proofErr w:type="spellStart"/>
+      <w:r>
+        <w:t>behavior</w:t>
+      </w:r>
+      <w:proofErr w:type="gramStart"/>
+      <w:r>
+        <w:t>:”smooth</w:t>
+      </w:r>
+      <w:proofErr w:type="spellEnd"/>
+      <w:proofErr w:type="gramEnd"/>
+      <w:r>
+        <w:t>”</w:t>
+      </w:r>
+    </w:p>
+    <w:p>
+      <w:pPr>
+        <w:pStyle w:val="ListParagraph"/>
+        <w:numPr>
+          <w:ilvl w:val="0"/>
+          <w:numId w:val="1"/>
+        </w:numPr>
+      </w:pPr>
+      <w:r>
+        <w:t>Now add the logout button below the block user button in details section and style it</w:t>
+      </w:r>
+    </w:p>
+    <w:p>
+      <w:pPr>
+        <w:pStyle w:val="ListParagraph"/>
+        <w:numPr>
+          <w:ilvl w:val="0"/>
+          <w:numId w:val="1"/>
+        </w:numPr>
+      </w:pPr>
+      <w:r>
+        <w:t xml:space="preserve">Now make a new component login and </w:t>
+      </w:r>
+      <w:proofErr w:type="spellStart"/>
+      <w:r>
+        <w:t>ad</w:t>
+      </w:r>
+      <w:proofErr w:type="spellEnd"/>
+      <w:r>
+        <w:t xml:space="preserve"> it to the </w:t>
+      </w:r>
+      <w:proofErr w:type="spellStart"/>
+      <w:r>
+        <w:t>app.jsx</w:t>
+      </w:r>
+      <w:proofErr w:type="spellEnd"/>
+      <w:r>
+        <w:t xml:space="preserve"> and there create a user </w:t>
+      </w:r>
+      <w:proofErr w:type="spellStart"/>
+      <w:r>
+        <w:t>const</w:t>
+      </w:r>
+      <w:proofErr w:type="spellEnd"/>
+      <w:r>
+        <w:t xml:space="preserve"> which s Boolean and in the container use </w:t>
+      </w:r>
+      <w:proofErr w:type="gramStart"/>
+      <w:r>
+        <w:t>the ?</w:t>
+      </w:r>
+      <w:proofErr w:type="gramEnd"/>
+      <w:r>
+        <w:t xml:space="preserve"> operator on user i.e. if user is present then show the three components and if not present then show the login page</w:t>
       </w:r>
       <w:bookmarkStart w:id="0" w:name="_GoBack"/>
       <w:bookmarkEnd w:id="0"/>
+      <w:r>
+        <w:t xml:space="preserve"> </w:t>
+      </w:r>
     </w:p>
     <w:sectPr>
       <w:pgSz w:w="12240" w:h="15840"/>
@@ -780,7 +916,7 @@
 </file>
 
 <file path=word/numbering.xml><?xml version="1.0" encoding="utf-8"?>
-<w:numbering xmlns:wpc="http://schemas.microsoft.com/office/word/2010/wordprocessingCanvas" xmlns:cx="http://schemas.microsoft.com/office/drawing/2014/chartex" xmlns:cx1="http://schemas.microsoft.com/office/drawing/2015/9/8/chartex" xmlns:mc="http://schemas.openxmlformats.org/markup-compatibility/2006" xmlns:o="urn:schemas-microsoft-com:office:office" xmlns:r="http://schemas.openxmlformats.org/officeDocument/2006/relationships" xmlns:m="http://schemas.openxmlformats.org/officeDocument/2006/math" xmlns:v="urn:schemas-microsoft-com:vml" xmlns:wp14="http://schemas.microsoft.com/office/word/2010/wordprocessingDrawing" xmlns:wp="http://schemas.openxmlformats.org/drawingml/2006/wordprocessingDrawing" xmlns:w10="urn:schemas-microsoft-com:office:word" xmlns:w="http://schemas.openxmlformats.org/wordprocessingml/2006/main" xmlns:w14="http://schemas.microsoft.com/office/word/2010/wordml" xmlns:w15="http://schemas.microsoft.com/office/word/2012/wordml" xmlns:w16se="http://schemas.microsoft.com/office/word/2015/wordml/symex" xmlns:wpg="http://schemas.microsoft.com/office/word/2010/wordprocessingGroup" xmlns:wpi="http://schemas.microsoft.com/office/word/2010/wordprocessingInk" xmlns:wne="http://schemas.microsoft.com/office/word/2006/wordml" xmlns:wps="http://schemas.microsoft.com/office/word/2010/wordprocessingShape" mc:Ignorable="w14 w15 w16se wp14">
+<w:numbering xmlns:wpc="http://schemas.microsoft.com/office/word/2010/wordprocessingCanvas" xmlns:cx="http://schemas.microsoft.com/office/drawing/2014/chartex" xmlns:mc="http://schemas.openxmlformats.org/markup-compatibility/2006" xmlns:o="urn:schemas-microsoft-com:office:office" xmlns:r="http://schemas.openxmlformats.org/officeDocument/2006/relationships" xmlns:m="http://schemas.openxmlformats.org/officeDocument/2006/math" xmlns:v="urn:schemas-microsoft-com:vml" xmlns:wp14="http://schemas.microsoft.com/office/word/2010/wordprocessingDrawing" xmlns:wp="http://schemas.openxmlformats.org/drawingml/2006/wordprocessingDrawing" xmlns:w10="urn:schemas-microsoft-com:office:word" xmlns:w="http://schemas.openxmlformats.org/wordprocessingml/2006/main" xmlns:w14="http://schemas.microsoft.com/office/word/2010/wordml" xmlns:w15="http://schemas.microsoft.com/office/word/2012/wordml" xmlns:w16se="http://schemas.microsoft.com/office/word/2015/wordml/symex" xmlns:wpg="http://schemas.microsoft.com/office/word/2010/wordprocessingGroup" xmlns:wpi="http://schemas.microsoft.com/office/word/2010/wordprocessingInk" xmlns:wne="http://schemas.microsoft.com/office/word/2006/wordml" xmlns:wps="http://schemas.microsoft.com/office/word/2010/wordprocessingShape" mc:Ignorable="w14 w15 w16se wp14">
   <w:abstractNum w:abstractNumId="0" w15:restartNumberingAfterBreak="0">
     <w:nsid w:val="099A79B5"/>
     <w:multiLevelType w:val="hybridMultilevel"/>

</xml_diff>

<commit_message>
firebase configuration stage reached
</commit_message>
<xml_diff>
--- a/Roadmap.docx
+++ b/Roadmap.docx
@@ -1,6 +1,6 @@
 
 <file path=word/document.xml><?xml version="1.0" encoding="utf-8"?>
-<w:document xmlns:wpc="http://schemas.microsoft.com/office/word/2010/wordprocessingCanvas" xmlns:cx="http://schemas.microsoft.com/office/drawing/2014/chartex" xmlns:cx1="http://schemas.microsoft.com/office/drawing/2015/9/8/chartex" xmlns:mc="http://schemas.openxmlformats.org/markup-compatibility/2006" xmlns:o="urn:schemas-microsoft-com:office:office" xmlns:r="http://schemas.openxmlformats.org/officeDocument/2006/relationships" xmlns:m="http://schemas.openxmlformats.org/officeDocument/2006/math" xmlns:v="urn:schemas-microsoft-com:vml" xmlns:wp14="http://schemas.microsoft.com/office/word/2010/wordprocessingDrawing" xmlns:wp="http://schemas.openxmlformats.org/drawingml/2006/wordprocessingDrawing" xmlns:w10="urn:schemas-microsoft-com:office:word" xmlns:w="http://schemas.openxmlformats.org/wordprocessingml/2006/main" xmlns:w14="http://schemas.microsoft.com/office/word/2010/wordml" xmlns:w15="http://schemas.microsoft.com/office/word/2012/wordml" xmlns:w16se="http://schemas.microsoft.com/office/word/2015/wordml/symex" xmlns:wpg="http://schemas.microsoft.com/office/word/2010/wordprocessingGroup" xmlns:wpi="http://schemas.microsoft.com/office/word/2010/wordprocessingInk" xmlns:wne="http://schemas.microsoft.com/office/word/2006/wordml" xmlns:wps="http://schemas.microsoft.com/office/word/2010/wordprocessingShape" mc:Ignorable="w14 w15 w16se wp14">
+<w:document xmlns:wpc="http://schemas.microsoft.com/office/word/2010/wordprocessingCanvas" xmlns:cx="http://schemas.microsoft.com/office/drawing/2014/chartex" xmlns:mc="http://schemas.openxmlformats.org/markup-compatibility/2006" xmlns:o="urn:schemas-microsoft-com:office:office" xmlns:r="http://schemas.openxmlformats.org/officeDocument/2006/relationships" xmlns:m="http://schemas.openxmlformats.org/officeDocument/2006/math" xmlns:v="urn:schemas-microsoft-com:vml" xmlns:wp14="http://schemas.microsoft.com/office/word/2010/wordprocessingDrawing" xmlns:wp="http://schemas.openxmlformats.org/drawingml/2006/wordprocessingDrawing" xmlns:w10="urn:schemas-microsoft-com:office:word" xmlns:w="http://schemas.openxmlformats.org/wordprocessingml/2006/main" xmlns:w14="http://schemas.microsoft.com/office/word/2010/wordml" xmlns:w15="http://schemas.microsoft.com/office/word/2012/wordml" xmlns:w16se="http://schemas.microsoft.com/office/word/2015/wordml/symex" xmlns:wpg="http://schemas.microsoft.com/office/word/2010/wordprocessingGroup" xmlns:wpi="http://schemas.microsoft.com/office/word/2010/wordprocessingInk" xmlns:wne="http://schemas.microsoft.com/office/word/2006/wordml" xmlns:wps="http://schemas.microsoft.com/office/word/2010/wordprocessingShape" mc:Ignorable="w14 w15 w16se wp14">
   <w:body>
     <w:p>
       <w:pPr>
@@ -892,308 +892,485 @@
       </w:r>
       <w:proofErr w:type="gramEnd"/>
       <w:r>
+        <w:t xml:space="preserve"> operator on user i.e. if user is present then show the three components and if not present then show the login page</w:t>
+      </w:r>
+      <w:r>
+        <w:t>.</w:t>
+      </w:r>
+    </w:p>
+    <w:p>
+      <w:pPr>
+        <w:pStyle w:val="ListParagraph"/>
+        <w:numPr>
+          <w:ilvl w:val="0"/>
+          <w:numId w:val="1"/>
+        </w:numPr>
+      </w:pPr>
+      <w:r>
+        <w:t>Now the login page is divided into two parts the left side is for login details and the right side is for signup details.</w:t>
+      </w:r>
+    </w:p>
+    <w:p>
+      <w:pPr>
+        <w:pStyle w:val="ListParagraph"/>
+        <w:numPr>
+          <w:ilvl w:val="0"/>
+          <w:numId w:val="1"/>
+        </w:numPr>
+      </w:pPr>
+      <w:r>
+        <w:t xml:space="preserve">First create 2 </w:t>
+      </w:r>
+      <w:proofErr w:type="spellStart"/>
+      <w:r>
+        <w:t>divs</w:t>
+      </w:r>
+      <w:proofErr w:type="spellEnd"/>
+      <w:r>
         <w:t xml:space="preserve"> </w:t>
       </w:r>
       <w:proofErr w:type="gramStart"/>
       <w:r>
-        <w:t>operator</w:t>
+        <w:t>called  items</w:t>
       </w:r>
       <w:proofErr w:type="gramEnd"/>
       <w:r>
-        <w:t xml:space="preserve"> on user i.e. if user is present then show the three components and if not present then show the login page</w:t>
-      </w:r>
-      <w:r>
-        <w:t>.</w:t>
-      </w:r>
-    </w:p>
-    <w:p>
-      <w:pPr>
-        <w:pStyle w:val="ListParagraph"/>
-        <w:numPr>
-          <w:ilvl w:val="0"/>
-          <w:numId w:val="1"/>
-        </w:numPr>
-      </w:pPr>
-      <w:r>
-        <w:t>Now the login page is divided into two parts the left side is for login details and the right side is for signup details.</w:t>
-      </w:r>
-    </w:p>
-    <w:p>
-      <w:pPr>
-        <w:pStyle w:val="ListParagraph"/>
-        <w:numPr>
-          <w:ilvl w:val="0"/>
-          <w:numId w:val="1"/>
-        </w:numPr>
-      </w:pPr>
-      <w:r>
-        <w:t xml:space="preserve">First create 2 </w:t>
-      </w:r>
-      <w:proofErr w:type="spellStart"/>
-      <w:r>
-        <w:t>divs</w:t>
-      </w:r>
-      <w:proofErr w:type="spellEnd"/>
+        <w:t xml:space="preserve"> and separate them by a div called separator.</w:t>
+      </w:r>
+    </w:p>
+    <w:p>
+      <w:pPr>
+        <w:pStyle w:val="ListParagraph"/>
+        <w:numPr>
+          <w:ilvl w:val="0"/>
+          <w:numId w:val="1"/>
+        </w:numPr>
+      </w:pPr>
+      <w:r>
+        <w:t>The first item contains a heading of welcome and below it</w:t>
+      </w:r>
       <w:r>
         <w:t xml:space="preserve"> </w:t>
       </w:r>
+      <w:r>
+        <w:t xml:space="preserve">a form element containing two input fields of email and password and below them a sign in </w:t>
+      </w:r>
+      <w:r>
+        <w:t>button and the second Item contains a heading of create</w:t>
+      </w:r>
+      <w:r>
+        <w:t xml:space="preserve"> an</w:t>
+      </w:r>
+      <w:r>
+        <w:t xml:space="preserve"> account</w:t>
+      </w:r>
+      <w:r>
+        <w:t xml:space="preserve"> </w:t>
+      </w:r>
+      <w:r>
+        <w:t xml:space="preserve">and a form with 3 inputs username, email and password and another input of file type to upload an image and create it with a label and hide the input with internal style using </w:t>
+      </w:r>
+      <w:proofErr w:type="spellStart"/>
+      <w:r>
+        <w:t>display:none</w:t>
+      </w:r>
+      <w:proofErr w:type="spellEnd"/>
+      <w:r>
+        <w:t xml:space="preserve"> and a signup button</w:t>
+      </w:r>
+    </w:p>
+    <w:p>
+      <w:pPr>
+        <w:pStyle w:val="ListParagraph"/>
+        <w:numPr>
+          <w:ilvl w:val="0"/>
+          <w:numId w:val="1"/>
+        </w:numPr>
+      </w:pPr>
+      <w:r>
+        <w:t xml:space="preserve">Now to upload image implement a </w:t>
+      </w:r>
+      <w:proofErr w:type="spellStart"/>
+      <w:r>
+        <w:t>useState</w:t>
+      </w:r>
+      <w:proofErr w:type="spellEnd"/>
+      <w:r>
+        <w:t xml:space="preserve"> of avatar and make it an object with file and </w:t>
+      </w:r>
+      <w:proofErr w:type="spellStart"/>
+      <w:r>
+        <w:t>url</w:t>
+      </w:r>
+      <w:proofErr w:type="spellEnd"/>
+      <w:r>
+        <w:t xml:space="preserve"> </w:t>
+      </w:r>
+      <w:r>
+        <w:t xml:space="preserve">and set it with the </w:t>
+      </w:r>
+      <w:proofErr w:type="spellStart"/>
+      <w:r>
+        <w:t>handleAvatar</w:t>
+      </w:r>
+      <w:proofErr w:type="spellEnd"/>
+      <w:r>
+        <w:t xml:space="preserve"> function applied on the </w:t>
+      </w:r>
+      <w:proofErr w:type="spellStart"/>
+      <w:r>
+        <w:t>onChange</w:t>
+      </w:r>
+      <w:proofErr w:type="spellEnd"/>
+      <w:r>
+        <w:t xml:space="preserve"> of file input</w:t>
+      </w:r>
+    </w:p>
+    <w:p>
+      <w:pPr>
+        <w:pStyle w:val="ListParagraph"/>
+        <w:numPr>
+          <w:ilvl w:val="0"/>
+          <w:numId w:val="1"/>
+        </w:numPr>
+      </w:pPr>
+      <w:r>
+        <w:t xml:space="preserve">Now style the login page and </w:t>
+      </w:r>
+      <w:proofErr w:type="spellStart"/>
+      <w:r>
+        <w:t>its</w:t>
+      </w:r>
+      <w:proofErr w:type="spellEnd"/>
+      <w:r>
+        <w:t xml:space="preserve"> all components</w:t>
+      </w:r>
+    </w:p>
+    <w:p>
+      <w:pPr>
+        <w:pStyle w:val="ListParagraph"/>
+        <w:numPr>
+          <w:ilvl w:val="0"/>
+          <w:numId w:val="1"/>
+        </w:numPr>
+      </w:pPr>
+      <w:r>
+        <w:t>Now style the separator div by giving it height width and background color</w:t>
+      </w:r>
+    </w:p>
+    <w:p>
+      <w:pPr>
+        <w:pStyle w:val="ListParagraph"/>
+        <w:numPr>
+          <w:ilvl w:val="0"/>
+          <w:numId w:val="1"/>
+        </w:numPr>
+      </w:pPr>
+      <w:r>
+        <w:t xml:space="preserve">To show error or success message install a library </w:t>
+      </w:r>
+      <w:proofErr w:type="spellStart"/>
+      <w:r>
+        <w:t>npm</w:t>
+      </w:r>
+      <w:proofErr w:type="spellEnd"/>
+      <w:r>
+        <w:t xml:space="preserve"> install react-</w:t>
+      </w:r>
+      <w:proofErr w:type="spellStart"/>
+      <w:r>
+        <w:t>toastify</w:t>
+      </w:r>
+      <w:proofErr w:type="spellEnd"/>
+    </w:p>
+    <w:p>
+      <w:pPr>
+        <w:pStyle w:val="ListParagraph"/>
+        <w:numPr>
+          <w:ilvl w:val="0"/>
+          <w:numId w:val="1"/>
+        </w:numPr>
+      </w:pPr>
+      <w:r>
+        <w:t xml:space="preserve">Create a new component Notification which </w:t>
+      </w:r>
+      <w:r>
+        <w:t xml:space="preserve">uses this </w:t>
+      </w:r>
+      <w:proofErr w:type="spellStart"/>
+      <w:r>
+        <w:t>ToastContainer</w:t>
+      </w:r>
+      <w:proofErr w:type="spellEnd"/>
+      <w:r>
+        <w:t xml:space="preserve"> </w:t>
+      </w:r>
+      <w:r>
+        <w:t xml:space="preserve"> to display the error, warn or success messages and use this component in the </w:t>
+      </w:r>
+      <w:proofErr w:type="spellStart"/>
+      <w:r>
+        <w:t>app.jsx</w:t>
+      </w:r>
+      <w:proofErr w:type="spellEnd"/>
+      <w:r>
+        <w:t xml:space="preserve"> with its position attribute and then apply it to the </w:t>
+      </w:r>
+      <w:proofErr w:type="spellStart"/>
+      <w:r>
+        <w:t>handleSubmit</w:t>
+      </w:r>
+      <w:proofErr w:type="spellEnd"/>
+      <w:r>
+        <w:t xml:space="preserve"> button of form to show the messages</w:t>
+      </w:r>
+    </w:p>
+    <w:p>
+      <w:pPr>
+        <w:pStyle w:val="ListParagraph"/>
+        <w:numPr>
+          <w:ilvl w:val="0"/>
+          <w:numId w:val="1"/>
+        </w:numPr>
+      </w:pPr>
+      <w:r>
+        <w:t xml:space="preserve">Next create another component in the </w:t>
+      </w:r>
+      <w:proofErr w:type="spellStart"/>
+      <w:r>
+        <w:t>chatlist</w:t>
+      </w:r>
+      <w:proofErr w:type="spellEnd"/>
+      <w:r>
+        <w:t xml:space="preserve"> folder which will show a modal in the middle of chat section in which we can search for a user</w:t>
+      </w:r>
+      <w:r>
+        <w:t xml:space="preserve"> and add it at the end of </w:t>
+      </w:r>
+      <w:proofErr w:type="spellStart"/>
+      <w:r>
+        <w:t>chatlist</w:t>
+      </w:r>
+      <w:proofErr w:type="spellEnd"/>
+      <w:r>
+        <w:t xml:space="preserve"> component</w:t>
+      </w:r>
+      <w:r>
+        <w:t xml:space="preserve">. For it create a component called </w:t>
+      </w:r>
+      <w:proofErr w:type="spellStart"/>
+      <w:r>
+        <w:t>addUser</w:t>
+      </w:r>
+      <w:proofErr w:type="spellEnd"/>
+      <w:r>
+        <w:t xml:space="preserve"> which contains a form element containing an input and a button with search text in it. After the form element there is a div called user which contains another div called detail which contains an </w:t>
+      </w:r>
+      <w:proofErr w:type="spellStart"/>
+      <w:r>
+        <w:t>img</w:t>
+      </w:r>
+      <w:proofErr w:type="spellEnd"/>
+      <w:r>
+        <w:t xml:space="preserve"> and a span containing username</w:t>
+      </w:r>
+    </w:p>
+    <w:p>
+      <w:pPr>
+        <w:pStyle w:val="ListParagraph"/>
+        <w:numPr>
+          <w:ilvl w:val="0"/>
+          <w:numId w:val="1"/>
+        </w:numPr>
+      </w:pPr>
+      <w:r>
+        <w:t>Now style this component so that it appears in the center of the page</w:t>
+      </w:r>
+      <w:r>
+        <w:t xml:space="preserve"> and also its inputs and buttons</w:t>
+      </w:r>
+    </w:p>
+    <w:p>
+      <w:pPr>
+        <w:pStyle w:val="ListParagraph"/>
+        <w:numPr>
+          <w:ilvl w:val="0"/>
+          <w:numId w:val="1"/>
+        </w:numPr>
+      </w:pPr>
+      <w:r>
+        <w:t xml:space="preserve">Now bind it to the plus button of </w:t>
+      </w:r>
+      <w:proofErr w:type="spellStart"/>
+      <w:r>
+        <w:t>chatlist</w:t>
+      </w:r>
+      <w:proofErr w:type="spellEnd"/>
+      <w:r>
+        <w:t xml:space="preserve"> so that it appears when the plus button is clicked as there is </w:t>
+      </w:r>
+      <w:proofErr w:type="spellStart"/>
+      <w:r>
+        <w:t>addMode</w:t>
+      </w:r>
+      <w:proofErr w:type="spellEnd"/>
+      <w:r>
+        <w:t xml:space="preserve"> state in the </w:t>
+      </w:r>
+      <w:proofErr w:type="spellStart"/>
+      <w:r>
+        <w:t>chatlist</w:t>
+      </w:r>
+      <w:proofErr w:type="spellEnd"/>
+      <w:r>
+        <w:t xml:space="preserve"> so use it with &amp;&amp; operator </w:t>
+      </w:r>
+    </w:p>
+    <w:p>
+      <w:pPr>
+        <w:pStyle w:val="ListParagraph"/>
+        <w:numPr>
+          <w:ilvl w:val="0"/>
+          <w:numId w:val="1"/>
+        </w:numPr>
+      </w:pPr>
+      <w:r>
+        <w:t>The front end is complete now starts the backend</w:t>
+      </w:r>
+    </w:p>
+    <w:p>
+      <w:pPr>
+        <w:pStyle w:val="ListParagraph"/>
+        <w:numPr>
+          <w:ilvl w:val="0"/>
+          <w:numId w:val="1"/>
+        </w:numPr>
+      </w:pPr>
+      <w:r>
+        <w:t xml:space="preserve">As for backend we are using firebase so first install the firebase library by </w:t>
+      </w:r>
+      <w:proofErr w:type="spellStart"/>
+      <w:r>
+        <w:t>npm</w:t>
+      </w:r>
+      <w:proofErr w:type="spellEnd"/>
+      <w:r>
+        <w:t xml:space="preserve"> install firebase</w:t>
+      </w:r>
+    </w:p>
+    <w:p>
+      <w:pPr>
+        <w:pStyle w:val="ListParagraph"/>
+        <w:numPr>
+          <w:ilvl w:val="0"/>
+          <w:numId w:val="1"/>
+        </w:numPr>
+      </w:pPr>
+      <w:r>
+        <w:t xml:space="preserve">Create a new folder lib and in it a file firebase.js and put the console code in it and also cut the </w:t>
+      </w:r>
+      <w:proofErr w:type="spellStart"/>
+      <w:r>
+        <w:t>api</w:t>
+      </w:r>
+      <w:proofErr w:type="spellEnd"/>
+      <w:r>
+        <w:t xml:space="preserve"> key value and place it in </w:t>
+      </w:r>
       <w:proofErr w:type="gramStart"/>
       <w:r>
-        <w:t>called  items</w:t>
-      </w:r>
+        <w:t>a .</w:t>
+      </w:r>
+      <w:proofErr w:type="spellStart"/>
+      <w:r>
+        <w:t>env</w:t>
+      </w:r>
+      <w:proofErr w:type="spellEnd"/>
       <w:proofErr w:type="gramEnd"/>
       <w:r>
-        <w:t xml:space="preserve"> and separate them by a div called separator.</w:t>
-      </w:r>
-    </w:p>
-    <w:p>
-      <w:pPr>
-        <w:pStyle w:val="ListParagraph"/>
-        <w:numPr>
-          <w:ilvl w:val="0"/>
-          <w:numId w:val="1"/>
-        </w:numPr>
-      </w:pPr>
-      <w:r>
-        <w:t>The first item contains a heading of welcome and below it</w:t>
-      </w:r>
-      <w:r>
-        <w:t xml:space="preserve"> </w:t>
-      </w:r>
-      <w:r>
-        <w:t xml:space="preserve">a form element containing two input fields of email and password and below them a sign in </w:t>
-      </w:r>
-      <w:r>
-        <w:t>button and the second Item contains a heading of create</w:t>
-      </w:r>
-      <w:r>
-        <w:t xml:space="preserve"> an</w:t>
-      </w:r>
-      <w:r>
-        <w:t xml:space="preserve"> account</w:t>
-      </w:r>
-      <w:r>
-        <w:t xml:space="preserve"> </w:t>
-      </w:r>
-      <w:r>
-        <w:t xml:space="preserve">and a form with 3 inputs username, email and password and another input of file type to upload an image and create it with a label and hide the input with internal style using </w:t>
-      </w:r>
-      <w:proofErr w:type="spellStart"/>
-      <w:r>
-        <w:t>display:none</w:t>
-      </w:r>
-      <w:proofErr w:type="spellEnd"/>
-      <w:r>
-        <w:t xml:space="preserve"> and a signup button</w:t>
-      </w:r>
-    </w:p>
-    <w:p>
-      <w:pPr>
-        <w:pStyle w:val="ListParagraph"/>
-        <w:numPr>
-          <w:ilvl w:val="0"/>
-          <w:numId w:val="1"/>
-        </w:numPr>
-      </w:pPr>
-      <w:r>
-        <w:t xml:space="preserve">Now to upload image implement a </w:t>
-      </w:r>
-      <w:proofErr w:type="spellStart"/>
-      <w:r>
-        <w:t>useState</w:t>
-      </w:r>
-      <w:proofErr w:type="spellEnd"/>
-      <w:r>
-        <w:t xml:space="preserve"> of avatar and make it an object with file and </w:t>
-      </w:r>
-      <w:proofErr w:type="spellStart"/>
-      <w:r>
-        <w:t>url</w:t>
-      </w:r>
-      <w:proofErr w:type="spellEnd"/>
-      <w:r>
-        <w:t xml:space="preserve"> </w:t>
-      </w:r>
-      <w:r>
-        <w:t xml:space="preserve">and set it with the </w:t>
-      </w:r>
-      <w:proofErr w:type="spellStart"/>
-      <w:r>
-        <w:t>handleAvatar</w:t>
-      </w:r>
-      <w:proofErr w:type="spellEnd"/>
-      <w:r>
-        <w:t xml:space="preserve"> function applied on the </w:t>
-      </w:r>
-      <w:proofErr w:type="spellStart"/>
-      <w:r>
-        <w:t>onChange</w:t>
-      </w:r>
-      <w:proofErr w:type="spellEnd"/>
-      <w:r>
-        <w:t xml:space="preserve"> of file input</w:t>
-      </w:r>
-    </w:p>
-    <w:p>
-      <w:pPr>
-        <w:pStyle w:val="ListParagraph"/>
-        <w:numPr>
-          <w:ilvl w:val="0"/>
-          <w:numId w:val="1"/>
-        </w:numPr>
-      </w:pPr>
-      <w:r>
-        <w:t xml:space="preserve">Now style the login page and </w:t>
-      </w:r>
-      <w:proofErr w:type="spellStart"/>
-      <w:r>
-        <w:t>its</w:t>
-      </w:r>
-      <w:proofErr w:type="spellEnd"/>
-      <w:r>
-        <w:t xml:space="preserve"> all components</w:t>
-      </w:r>
-    </w:p>
-    <w:p>
-      <w:pPr>
-        <w:pStyle w:val="ListParagraph"/>
-        <w:numPr>
-          <w:ilvl w:val="0"/>
-          <w:numId w:val="1"/>
-        </w:numPr>
-      </w:pPr>
-      <w:r>
-        <w:t>Now style the separator div by giving it height width and background color</w:t>
-      </w:r>
-    </w:p>
-    <w:p>
-      <w:pPr>
-        <w:pStyle w:val="ListParagraph"/>
-        <w:numPr>
-          <w:ilvl w:val="0"/>
-          <w:numId w:val="1"/>
-        </w:numPr>
-      </w:pPr>
-      <w:r>
-        <w:t xml:space="preserve">To show error or success message install a library </w:t>
-      </w:r>
-      <w:proofErr w:type="spellStart"/>
-      <w:r>
-        <w:t>npm</w:t>
-      </w:r>
-      <w:proofErr w:type="spellEnd"/>
-      <w:r>
-        <w:t xml:space="preserve"> install react-</w:t>
-      </w:r>
-      <w:proofErr w:type="spellStart"/>
-      <w:r>
-        <w:t>toastify</w:t>
-      </w:r>
-      <w:proofErr w:type="spellEnd"/>
-    </w:p>
-    <w:p>
-      <w:pPr>
-        <w:pStyle w:val="ListParagraph"/>
-        <w:numPr>
-          <w:ilvl w:val="0"/>
-          <w:numId w:val="1"/>
-        </w:numPr>
-      </w:pPr>
-      <w:r>
-        <w:t xml:space="preserve">Create a new component Notification which </w:t>
-      </w:r>
-      <w:r>
-        <w:t xml:space="preserve">uses this </w:t>
-      </w:r>
-      <w:proofErr w:type="spellStart"/>
-      <w:r>
-        <w:t>ToastContainer</w:t>
-      </w:r>
-      <w:proofErr w:type="spellEnd"/>
-      <w:r>
-        <w:t xml:space="preserve"> </w:t>
-      </w:r>
-      <w:r>
-        <w:t xml:space="preserve"> to display the error, warn or success messages and use this component in the </w:t>
-      </w:r>
-      <w:proofErr w:type="spellStart"/>
-      <w:r>
-        <w:t>app.jsx</w:t>
-      </w:r>
-      <w:proofErr w:type="spellEnd"/>
-      <w:r>
-        <w:t xml:space="preserve"> with its position attribute and then apply it to the </w:t>
-      </w:r>
-      <w:proofErr w:type="spellStart"/>
-      <w:r>
-        <w:t>handleSubmit</w:t>
-      </w:r>
-      <w:proofErr w:type="spellEnd"/>
-      <w:r>
-        <w:t xml:space="preserve"> button of form to show the messages</w:t>
-      </w:r>
-    </w:p>
-    <w:p>
-      <w:pPr>
-        <w:pStyle w:val="ListParagraph"/>
-        <w:numPr>
-          <w:ilvl w:val="0"/>
-          <w:numId w:val="1"/>
-        </w:numPr>
-      </w:pPr>
-      <w:r>
-        <w:t xml:space="preserve">Next create another component in the </w:t>
-      </w:r>
-      <w:proofErr w:type="spellStart"/>
-      <w:r>
-        <w:t>chatlist</w:t>
-      </w:r>
-      <w:proofErr w:type="spellEnd"/>
-      <w:r>
-        <w:t xml:space="preserve"> folder which will show a modal in the middle of chat section in which we can search for a user</w:t>
-      </w:r>
-      <w:r>
-        <w:t xml:space="preserve"> and add it at the end of </w:t>
-      </w:r>
-      <w:proofErr w:type="spellStart"/>
-      <w:r>
-        <w:t>chatlist</w:t>
-      </w:r>
-      <w:proofErr w:type="spellEnd"/>
-      <w:r>
-        <w:t xml:space="preserve"> component</w:t>
-      </w:r>
-      <w:r>
-        <w:t xml:space="preserve">. For it create a component called </w:t>
-      </w:r>
-      <w:proofErr w:type="spellStart"/>
-      <w:r>
-        <w:t>addUser</w:t>
-      </w:r>
-      <w:proofErr w:type="spellEnd"/>
-      <w:r>
-        <w:t xml:space="preserve"> which contains a form element containing an input and a button with search text in it. After the form element there is a div called user which contains another div called detail which contains an </w:t>
-      </w:r>
-      <w:proofErr w:type="spellStart"/>
-      <w:r>
-        <w:t>img</w:t>
-      </w:r>
-      <w:proofErr w:type="spellEnd"/>
-      <w:r>
-        <w:t xml:space="preserve"> and a span containing username</w:t>
-      </w:r>
-    </w:p>
-    <w:p>
-      <w:pPr>
-        <w:pStyle w:val="ListParagraph"/>
-        <w:numPr>
-          <w:ilvl w:val="0"/>
-          <w:numId w:val="1"/>
-        </w:numPr>
-      </w:pPr>
-      <w:r>
-        <w:t>Now style this component so that it appears in the center of the page</w:t>
-      </w:r>
+        <w:t xml:space="preserve"> file which is also created by self</w:t>
+      </w:r>
+    </w:p>
+    <w:p>
+      <w:pPr>
+        <w:pStyle w:val="ListParagraph"/>
+        <w:numPr>
+          <w:ilvl w:val="0"/>
+          <w:numId w:val="1"/>
+        </w:numPr>
+      </w:pPr>
+      <w:r>
+        <w:t xml:space="preserve">Now set up the firebase from console first the authentication set to email and password and then then </w:t>
+      </w:r>
+      <w:proofErr w:type="spellStart"/>
+      <w:r>
+        <w:t>firestore</w:t>
+      </w:r>
+      <w:proofErr w:type="spellEnd"/>
+      <w:r>
+        <w:t xml:space="preserve"> database</w:t>
+      </w:r>
+    </w:p>
+    <w:p>
+      <w:pPr>
+        <w:pStyle w:val="ListParagraph"/>
+        <w:numPr>
+          <w:ilvl w:val="0"/>
+          <w:numId w:val="1"/>
+        </w:numPr>
+      </w:pPr>
+      <w:r>
+        <w:t xml:space="preserve">Now create two variables </w:t>
+      </w:r>
+      <w:proofErr w:type="spellStart"/>
+      <w:r>
+        <w:t>auth</w:t>
+      </w:r>
+      <w:proofErr w:type="spellEnd"/>
+      <w:r>
+        <w:t xml:space="preserve"> and </w:t>
+      </w:r>
+      <w:proofErr w:type="spellStart"/>
+      <w:r>
+        <w:t>db</w:t>
+      </w:r>
+      <w:proofErr w:type="spellEnd"/>
+      <w:r>
+        <w:t xml:space="preserve"> in the </w:t>
+      </w:r>
+      <w:proofErr w:type="spellStart"/>
+      <w:r>
+        <w:t>firebase.jsx</w:t>
+      </w:r>
+      <w:proofErr w:type="spellEnd"/>
+      <w:r>
+        <w:t xml:space="preserve"> file and give them </w:t>
+      </w:r>
+      <w:proofErr w:type="spellStart"/>
+      <w:r>
+        <w:t>getAuth</w:t>
+      </w:r>
+      <w:proofErr w:type="spellEnd"/>
+      <w:r>
+        <w:t xml:space="preserve"> and </w:t>
+      </w:r>
+      <w:proofErr w:type="spellStart"/>
+      <w:r>
+        <w:t>getFirestore</w:t>
+      </w:r>
+      <w:proofErr w:type="spellEnd"/>
+      <w:r>
+        <w:t xml:space="preserve"> which are imported from firebase</w:t>
+      </w:r>
+    </w:p>
+    <w:p>
+      <w:pPr>
+        <w:pStyle w:val="ListParagraph"/>
+        <w:numPr>
+          <w:ilvl w:val="0"/>
+          <w:numId w:val="1"/>
+        </w:numPr>
+      </w:pPr>
       <w:bookmarkStart w:id="0" w:name="_GoBack"/>
       <w:bookmarkEnd w:id="0"/>
     </w:p>
@@ -1208,7 +1385,7 @@
 </file>
 
 <file path=word/numbering.xml><?xml version="1.0" encoding="utf-8"?>
-<w:numbering xmlns:wpc="http://schemas.microsoft.com/office/word/2010/wordprocessingCanvas" xmlns:cx="http://schemas.microsoft.com/office/drawing/2014/chartex" xmlns:cx1="http://schemas.microsoft.com/office/drawing/2015/9/8/chartex" xmlns:mc="http://schemas.openxmlformats.org/markup-compatibility/2006" xmlns:o="urn:schemas-microsoft-com:office:office" xmlns:r="http://schemas.openxmlformats.org/officeDocument/2006/relationships" xmlns:m="http://schemas.openxmlformats.org/officeDocument/2006/math" xmlns:v="urn:schemas-microsoft-com:vml" xmlns:wp14="http://schemas.microsoft.com/office/word/2010/wordprocessingDrawing" xmlns:wp="http://schemas.openxmlformats.org/drawingml/2006/wordprocessingDrawing" xmlns:w10="urn:schemas-microsoft-com:office:word" xmlns:w="http://schemas.openxmlformats.org/wordprocessingml/2006/main" xmlns:w14="http://schemas.microsoft.com/office/word/2010/wordml" xmlns:w15="http://schemas.microsoft.com/office/word/2012/wordml" xmlns:w16se="http://schemas.microsoft.com/office/word/2015/wordml/symex" xmlns:wpg="http://schemas.microsoft.com/office/word/2010/wordprocessingGroup" xmlns:wpi="http://schemas.microsoft.com/office/word/2010/wordprocessingInk" xmlns:wne="http://schemas.microsoft.com/office/word/2006/wordml" xmlns:wps="http://schemas.microsoft.com/office/word/2010/wordprocessingShape" mc:Ignorable="w14 w15 w16se wp14">
+<w:numbering xmlns:wpc="http://schemas.microsoft.com/office/word/2010/wordprocessingCanvas" xmlns:cx="http://schemas.microsoft.com/office/drawing/2014/chartex" xmlns:mc="http://schemas.openxmlformats.org/markup-compatibility/2006" xmlns:o="urn:schemas-microsoft-com:office:office" xmlns:r="http://schemas.openxmlformats.org/officeDocument/2006/relationships" xmlns:m="http://schemas.openxmlformats.org/officeDocument/2006/math" xmlns:v="urn:schemas-microsoft-com:vml" xmlns:wp14="http://schemas.microsoft.com/office/word/2010/wordprocessingDrawing" xmlns:wp="http://schemas.openxmlformats.org/drawingml/2006/wordprocessingDrawing" xmlns:w10="urn:schemas-microsoft-com:office:word" xmlns:w="http://schemas.openxmlformats.org/wordprocessingml/2006/main" xmlns:w14="http://schemas.microsoft.com/office/word/2010/wordml" xmlns:w15="http://schemas.microsoft.com/office/word/2012/wordml" xmlns:w16se="http://schemas.microsoft.com/office/word/2015/wordml/symex" xmlns:wpg="http://schemas.microsoft.com/office/word/2010/wordprocessingGroup" xmlns:wpi="http://schemas.microsoft.com/office/word/2010/wordprocessingInk" xmlns:wne="http://schemas.microsoft.com/office/word/2006/wordml" xmlns:wps="http://schemas.microsoft.com/office/word/2010/wordprocessingShape" mc:Ignorable="w14 w15 w16se wp14">
   <w:abstractNum w:abstractNumId="0" w15:restartNumberingAfterBreak="0">
     <w:nsid w:val="099A79B5"/>
     <w:multiLevelType w:val="hybridMultilevel"/>

</xml_diff>